<commit_message>
Regolamento su pagina HTML, email torneolegazzi, PDF aggiornato
- Regolamento riscritto direttamente in HTML con card punteggio e scadenze
- Tasto per aprire il PDF completo in nuova scheda
- Email aggiornata a torneolegazzi@gmail.com in config.json e PDF
- Spiegazione classifica finale corretta (calcolata da Excel, non manuale)

Co-Authored-By: Claude Sonnet 4.6 <noreply@anthropic.com>
</commit_message>
<xml_diff>
--- a/pdf/regolamento.docx
+++ b/pdf/regolamento.docx
@@ -296,7 +296,7 @@
           <w:color w:val="1A1A2E"/>
           <w:sz w:val="22"/>
         </w:rPr>
-        <w:t>La classifica pronosticata viene inserita direttamente nel file Excel, nel foglio dedicato, compilando la graduatoria completa delle 20 squadre dalla 1ª alla 20ª posizione.</w:t>
+        <w:t>La classifica pronosticata NON viene inserita a mano: il file Excel la calcola automaticamente nel terzo foglio (Classifica) in base a tutti i risultati pronosticati dal giocatore. Da quella classifica calcolata si leggono le posizioni e si assegnano i punti bonus.</w:t>
       </w:r>
     </w:p>
     <w:p>
@@ -1305,7 +1305,7 @@
           <w:color w:val="6C757D"/>
           <w:sz w:val="18"/>
         </w:rPr>
-        <w:t>Torneo Legazzi — gianlucafinetti821@gmail.com</w:t>
+        <w:t>Torneo Legazzi — torneolegazzi@gmail.com</w:t>
       </w:r>
     </w:p>
     <w:sectPr>

</xml_diff>

<commit_message>
Regolamento PDF: quota via link sul sito + montepremi senza incasso
Co-Authored-By: Claude Opus 4.8 <noreply@anthropic.com>
</commit_message>
<xml_diff>
--- a/pdf/regolamento.docx
+++ b/pdf/regolamento.docx
@@ -88,7 +88,7 @@
           <w:color w:val="1A1A2E"/>
           <w:sz w:val="22"/>
         </w:rPr>
-        <w:t>Il torneo è aperto a tutti i partecipanti invitati. La quota di iscrizione è di 10€ a persona, da versare tramite Revolut entro la data di chiusura delle iscrizioni.</w:t>
+        <w:t>Il torneo è aperto a tutti i partecipanti invitati. La quota di iscrizione è di 10€ a persona, da versare tramite l'apposito link presente sul sito ufficiale entro la data di chiusura delle iscrizioni.</w:t>
       </w:r>
     </w:p>
     <w:p>
@@ -168,7 +168,7 @@
           <w:i w:val="0"/>
           <w:sz w:val="22"/>
         </w:rPr>
-        <w:t>Versare la quota di iscrizione di 10€.</w:t>
+        <w:t>Versare la quota di iscrizione di 10€ tramite l'apposito link sul sito.</w:t>
       </w:r>
     </w:p>
     <w:p>
@@ -1135,7 +1135,7 @@
           <w:i/>
           <w:sz w:val="22"/>
         </w:rPr>
-        <w:t>Il montepremi verrà comunicato ufficialmente una volta chiuse le iscrizioni, in base al numero definitivo di partecipanti. La distribuzione tra i primi classificati sarà annunciata contestualmente.</w:t>
+        <w:t>Il montepremi verrà comunicato ufficialmente una volta chiuse le iscrizioni, in base al numero definitivo di partecipanti. La distribuzione tra i primi classificati sarà annunciata contestualmente. L'intero ammontare delle quote raccolte è destinato esclusivamente al montepremi ed eventuali coppe o premi per i vincitori: l'organizzatore non trattiene alcun incasso.</w:t>
       </w:r>
     </w:p>
     <w:p>

</xml_diff>